<commit_message>
docs: perbaiki path output gen_docx.py + regenerasi DOKUMENTASI_TEKNOLOGI.docx
</commit_message>
<xml_diff>
--- a/DOKUMENTASI_TEKNOLOGI.docx
+++ b/DOKUMENTASI_TEKNOLOGI.docx
@@ -128,23 +128,6 @@
         </ns0:numPr>
       </ns0:pPr>
       <ns0:r>
-        <ns0:t xml:space="preserve">Charts: Recharts (bar chart kompetensi)</ns0:t>
-      </ns0:r>
-    </ns0:p>
-    <ns0:p>
-      <ns0:pPr>
-        <ns0:numPr>
-          <ns0:ilvl ns0:val="0"/>
-          <ns0:numId ns0:val="1"/>
-        </ns0:numPr>
-      </ns0:pPr>
-      <ns0:pPr>
-        <ns0:numPr>
-          <ns0:ilvl ns0:val="0"/>
-          <ns0:numId ns0:val="1"/>
-        </ns0:numPr>
-      </ns0:pPr>
-      <ns0:r>
         <ns0:t xml:space="preserve">Export: jsPDF + jspdf-autotable (PDF), SheetJS/XLSX (Excel)</ns0:t>
       </ns0:r>
     </ns0:p>
@@ -899,7 +882,7 @@
     </ns0:p>
     <ns0:p>
       <ns0:r>
-        <ns0:t xml:space="preserve">9 tabel yang diakses oleh client code:</ns0:t>
+        <ns0:t xml:space="preserve">10 tabel yang diakses oleh client code:</ns0:t>
       </ns0:r>
     </ns0:p>
     <ns0:p>
@@ -950,7 +933,7 @@
         </ns0:numPr>
       </ns0:pPr>
       <ns0:r>
-        <ns0:t xml:space="preserve">institutions: Institusi/kampus (id, name, type PTN/PTS/Kedinasan, location, grade, range_min/max)</ns0:t>
+        <ns0:t xml:space="preserve">institutions: Institusi/kampus (id, name, abbreviation untuk pencarian singkatan, type PTN/PTS/Kedinasan, location, grade, range_min/max)</ns0:t>
       </ns0:r>
     </ns0:p>
     <ns0:p>
@@ -984,6 +967,23 @@
         </ns0:numPr>
       </ns0:pPr>
       <ns0:r>
+        <ns0:t xml:space="preserve">utbk_scores: Riwayat input nilai tryout UTBK mandiri user (user_id, total_score, scores JSONB 7 subtes, label, recorded_on)</ns0:t>
+      </ns0:r>
+    </ns0:p>
+    <ns0:p>
+      <ns0:pPr>
+        <ns0:numPr>
+          <ns0:ilvl ns0:val="0"/>
+          <ns0:numId ns0:val="1"/>
+        </ns0:numPr>
+      </ns0:pPr>
+      <ns0:pPr>
+        <ns0:numPr>
+          <ns0:ilvl ns0:val="0"/>
+          <ns0:numId ns0:val="1"/>
+        </ns0:numPr>
+      </ns0:pPr>
+      <ns0:r>
         <ns0:t xml:space="preserve">target_institutions: Target prodi pilihan user (user_id, major_id, priority)</ns0:t>
       </ns0:r>
     </ns0:p>
@@ -1018,7 +1018,7 @@
         </ns0:numPr>
       </ns0:pPr>
       <ns0:r>
-        <ns0:t xml:space="preserve">penjurusan_questions: Bank soal tes penjurusan (question, option_a-d, cluster_a-d, is_active)</ns0:t>
+        <ns0:t xml:space="preserve">penjurusan_questions: Bank soal tes penjurusan (question, option_a-d, cluster_a-d, weight_a-d bobot 1-5, is_active)</ns0:t>
       </ns0:r>
     </ns0:p>
     <ns0:p>
@@ -1246,7 +1246,7 @@
         </ns0:numPr>
       </ns0:pPr>
       <ns0:r>
-        <ns0:t xml:space="preserve">Hasil di-insert ke tryout_results dengan scores JSONB berisi nilai per subtes</ns0:t>
+        <ns0:t xml:space="preserve">Sejak pembaruan sumber nilai tunggal, hasil tryout TIDAK lagi disimpan/direkam (tidak insert ke tryout_results); modal "Kerjakan Tryout" hanya menghitung &amp; menampilkan skor sesaat</ns0:t>
       </ns0:r>
     </ns0:p>
     <ns0:p>
@@ -1264,24 +1264,24 @@
     </ns0:p>
     <ns0:p>
       <ns0:r>
-        <ns0:t xml:space="preserve">getAnalysis() di store.ts melakukan analisis murni client-side:</ns0:t>
-      </ns0:r>
-    </ns0:p>
-    <ns0:p>
-      <ns0:pPr>
-        <ns0:numPr>
-          <ns0:ilvl ns0:val="0"/>
-          <ns0:numId ns0:val="1"/>
-        </ns0:numPr>
-      </ns0:pPr>
-      <ns0:pPr>
-        <ns0:numPr>
-          <ns0:ilvl ns0:val="0"/>
-          <ns0:numId ns0:val="1"/>
-        </ns0:numPr>
-      </ns0:pPr>
-      <ns0:r>
-        <ns0:t xml:space="preserve">Membandingkan skor user dengan passing grade target major</ns0:t>
+        <ns0:t xml:space="preserve">getAnalysis() di store.ts melakukan analisis murni client-side dengan sumber nilai tunggal dari tabel utbk_scores (input "Input Nilai UTBK" terbaru di Dashboard):</ns0:t>
+      </ns0:r>
+    </ns0:p>
+    <ns0:p>
+      <ns0:pPr>
+        <ns0:numPr>
+          <ns0:ilvl ns0:val="0"/>
+          <ns0:numId ns0:val="1"/>
+        </ns0:numPr>
+      </ns0:pPr>
+      <ns0:pPr>
+        <ns0:numPr>
+          <ns0:ilvl ns0:val="0"/>
+          <ns0:numId ns0:val="1"/>
+        </ns0:numPr>
+      </ns0:pPr>
+      <ns0:r>
+        <ns0:t xml:space="preserve">Membandingkan skor UTBK user dengan passing grade target major</ns0:t>
       </ns0:r>
     </ns0:p>
     <ns0:p>
@@ -1342,6 +1342,212 @@
     </ns0:p>
     <ns0:p>
       <ns0:pPr>
+        <ns0:pStyle ns0:val="Heading2"/>
+      </ns0:pPr>
+      <ns0:r>
+        <ns0:t xml:space="preserve">5.8 Input Nilai UTBK Mandiri (Dashboard)</ns0:t>
+      </ns0:r>
+    </ns0:p>
+    <ns0:p>
+      <ns0:r>
+        <ns0:t xml:space="preserve">User dapat menginput skor tryout UTBK terakhirnya sendiri langsung dari Dashboard (total + rincian 7 subtes). Data disimpan permanen ke tabel utbk_scores:</ns0:t>
+      </ns0:r>
+    </ns0:p>
+    <ns0:p>
+      <ns0:pPr>
+        <ns0:numPr>
+          <ns0:ilvl ns0:val="0"/>
+          <ns0:numId ns0:val="1"/>
+        </ns0:numPr>
+      </ns0:pPr>
+      <ns0:pPr>
+        <ns0:numPr>
+          <ns0:ilvl ns0:val="0"/>
+          <ns0:numId ns0:val="1"/>
+        </ns0:numPr>
+      </ns0:pPr>
+      <ns0:r>
+        <ns0:t xml:space="preserve">addUtbkScore - Insert nilai baru ke riwayat (optimistic update, di-rollback bila insert gagal)</ns0:t>
+      </ns0:r>
+    </ns0:p>
+    <ns0:p>
+      <ns0:pPr>
+        <ns0:numPr>
+          <ns0:ilvl ns0:val="0"/>
+          <ns0:numId ns0:val="1"/>
+        </ns0:numPr>
+      </ns0:pPr>
+      <ns0:pPr>
+        <ns0:numPr>
+          <ns0:ilvl ns0:val="0"/>
+          <ns0:numId ns0:val="1"/>
+        </ns0:numPr>
+      </ns0:pPr>
+      <ns0:r>
+        <ns0:t xml:space="preserve">updateUtbkScore - Memperbarui entri riwayat yang ada</ns0:t>
+      </ns0:r>
+    </ns0:p>
+    <ns0:p>
+      <ns0:pPr>
+        <ns0:numPr>
+          <ns0:ilvl ns0:val="0"/>
+          <ns0:numId ns0:val="1"/>
+        </ns0:numPr>
+      </ns0:pPr>
+      <ns0:pPr>
+        <ns0:numPr>
+          <ns0:ilvl ns0:val="0"/>
+          <ns0:numId ns0:val="1"/>
+        </ns0:numPr>
+      </ns0:pPr>
+      <ns0:r>
+        <ns0:t xml:space="preserve">deleteUtbkScore - Menghapus entri riwayat</ns0:t>
+      </ns0:r>
+    </ns0:p>
+    <ns0:p>
+      <ns0:pPr>
+        <ns0:numPr>
+          <ns0:ilvl ns0:val="0"/>
+          <ns0:numId ns0:val="1"/>
+        </ns0:numPr>
+      </ns0:pPr>
+      <ns0:pPr>
+        <ns0:numPr>
+          <ns0:ilvl ns0:val="0"/>
+          <ns0:numId ns0:val="1"/>
+        </ns0:numPr>
+      </ns0:pPr>
+      <ns0:r>
+        <ns0:t xml:space="preserve">syncFromSupabase memuat ulang utbk_scores saat login, sehingga riwayat tetap tampil setiap dashboard dibuka</ns0:t>
+      </ns0:r>
+    </ns0:p>
+    <ns0:p>
+      <ns0:pPr>
+        <ns0:numPr>
+          <ns0:ilvl ns0:val="0"/>
+          <ns0:numId ns0:val="1"/>
+        </ns0:numPr>
+      </ns0:pPr>
+      <ns0:pPr>
+        <ns0:numPr>
+          <ns0:ilvl ns0:val="0"/>
+          <ns0:numId ns0:val="1"/>
+        </ns0:numPr>
+      </ns0:pPr>
+      <ns0:r>
+        <ns0:t xml:space="preserve">Dashboard merender rekap (skor terakhir, tertinggi, rata-rata, perubahan) dan grafik perkembangan memakai SVG line chart (tanpa library chart eksternal)</ns0:t>
+      </ns0:r>
+    </ns0:p>
+    <ns0:p>
+      <ns0:r>
+        <ns0:t xml:space="preserve"/>
+      </ns0:r>
+    </ns0:p>
+    <ns0:p>
+      <ns0:pPr>
+        <ns0:pStyle ns0:val="Heading2"/>
+      </ns0:pPr>
+      <ns0:r>
+        <ns0:t xml:space="preserve">5.9 Tes Penjurusan (Minat &amp; Bakat) Berbobot</ns0:t>
+      </ns0:r>
+    </ns0:p>
+    <ns0:p>
+      <ns0:r>
+        <ns0:t xml:space="preserve">Tes penjurusan di BingungView.tsx memetakan tiap opsi jawaban ke rumpun (Saintek/Soshum/Campuran) dengan bobot 1-5 (kolom weight_a-d pada penjurusan_questions):</ns0:t>
+      </ns0:r>
+    </ns0:p>
+    <ns0:p>
+      <ns0:pPr>
+        <ns0:numPr>
+          <ns0:ilvl ns0:val="0"/>
+          <ns0:numId ns0:val="1"/>
+        </ns0:numPr>
+      </ns0:pPr>
+      <ns0:pPr>
+        <ns0:numPr>
+          <ns0:ilvl ns0:val="0"/>
+          <ns0:numId ns0:val="1"/>
+        </ns0:numPr>
+      </ns0:pPr>
+      <ns0:r>
+        <ns0:t xml:space="preserve">Skor rumpun = akumulasi bobot opsi yang dipilih (weighted tally), bukan sekadar jumlah jawaban</ns0:t>
+      </ns0:r>
+    </ns0:p>
+    <ns0:p>
+      <ns0:pPr>
+        <ns0:numPr>
+          <ns0:ilvl ns0:val="0"/>
+          <ns0:numId ns0:val="1"/>
+        </ns0:numPr>
+      </ns0:pPr>
+      <ns0:pPr>
+        <ns0:numPr>
+          <ns0:ilvl ns0:val="0"/>
+          <ns0:numId ns0:val="1"/>
+        </ns0:numPr>
+      </ns0:pPr>
+      <ns0:r>
+        <ns0:t xml:space="preserve">Rumpun dominan = skor tertinggi; namun bila selisih skor tertinggi &amp; kedua &lt;= 10% total skor, hasil dianggap seimbang (Campuran)</ns0:t>
+      </ns0:r>
+    </ns0:p>
+    <ns0:p>
+      <ns0:pPr>
+        <ns0:numPr>
+          <ns0:ilvl ns0:val="0"/>
+          <ns0:numId ns0:val="1"/>
+        </ns0:numPr>
+      </ns0:pPr>
+      <ns0:pPr>
+        <ns0:numPr>
+          <ns0:ilvl ns0:val="0"/>
+          <ns0:numId ns0:val="1"/>
+        </ns0:numPr>
+      </ns0:pPr>
+      <ns0:r>
+        <ns0:t xml:space="preserve">Bar hasil menampilkan persentase = skor rumpun / total skor x 100 (plus jumlah poin)</ns0:t>
+      </ns0:r>
+    </ns0:p>
+    <ns0:p>
+      <ns0:pPr>
+        <ns0:numPr>
+          <ns0:ilvl ns0:val="0"/>
+          <ns0:numId ns0:val="1"/>
+        </ns0:numPr>
+      </ns0:pPr>
+      <ns0:pPr>
+        <ns0:numPr>
+          <ns0:ilvl ns0:val="0"/>
+          <ns0:numId ns0:val="1"/>
+        </ns0:numPr>
+      </ns0:pPr>
+      <ns0:r>
+        <ns0:t xml:space="preserve">Admin dapat mengatur bobot tiap opsi (1-5) di Bank Soal Penjurusan (AdminQuestionsView)</ns0:t>
+      </ns0:r>
+    </ns0:p>
+    <ns0:p>
+      <ns0:pPr>
+        <ns0:numPr>
+          <ns0:ilvl ns0:val="0"/>
+          <ns0:numId ns0:val="1"/>
+        </ns0:numPr>
+      </ns0:pPr>
+      <ns0:pPr>
+        <ns0:numPr>
+          <ns0:ilvl ns0:val="0"/>
+          <ns0:numId ns0:val="1"/>
+        </ns0:numPr>
+      </ns0:pPr>
+      <ns0:r>
+        <ns0:t xml:space="preserve">Pencarian kampus di seluruh aplikasi mendukung singkatan (kolom institutions.abbreviation) melalui helper institutionSearch + komponen CampusCombobox</ns0:t>
+      </ns0:r>
+    </ns0:p>
+    <ns0:p>
+      <ns0:r>
+        <ns0:t xml:space="preserve"/>
+      </ns0:r>
+    </ns0:p>
+    <ns0:p>
+      <ns0:pPr>
         <ns0:pStyle ns0:val="Heading1"/>
       </ns0:pPr>
       <ns0:r>
@@ -1397,7 +1603,7 @@
     </ns0:p>
     <ns0:p>
       <ns0:r>
-        <ns0:t xml:space="preserve">Di beberapa view (TryoutsView, AnalysisPassingView), jsPDF di-dynamic import agar tidak masuk bundle utama. ReportsView mengimport secara statis.</ns0:t>
+        <ns0:t xml:space="preserve">Di beberapa view (TryoutsView), jsPDF di-dynamic import agar tidak masuk bundle utama. ReportsView mengimport secara statis.</ns0:t>
       </ns0:r>
     </ns0:p>
     <ns0:p>
@@ -1436,43 +1642,25 @@
         <ns0:pStyle ns0:val="Heading2"/>
       </ns0:pPr>
       <ns0:r>
-        <ns0:t xml:space="preserve">7.1 Recharts</ns0:t>
-      </ns0:r>
-    </ns0:p>
-    <ns0:p>
-      <ns0:r>
-        <ns0:t xml:space="preserve">Satu-satunya chart di aplikasi: grouped vertical bar chart di AnalysisCompView.tsx yang membandingkan skor user vs rata-rata nasional per kompetensi subtes. Menggunakan ResponsiveContainer, BarChart, Bar, XAxis, YAxis, CartesianGrid, Tooltip, dan Cell untuk pewarnaan kondisional per bar.</ns0:t>
-      </ns0:r>
-    </ns0:p>
-    <ns0:p>
-      <ns0:r>
-        <ns0:t xml:space="preserve"/>
-      </ns0:r>
-    </ns0:p>
-    <ns0:p>
-      <ns0:pPr>
-        <ns0:pStyle ns0:val="Heading2"/>
-      </ns0:pPr>
-      <ns0:r>
-        <ns0:t xml:space="preserve">7.2 SweetAlert2</ns0:t>
-      </ns0:r>
-    </ns0:p>
-    <ns0:p>
-      <ns0:r>
-        <ns0:t xml:space="preserve">Digunakan sebagai mekanisme feedback utama untuk error, konfirmasi, dan success message di 6 file (AuthView, BingungView, ChangePasswordView, SupabaseSqlView, AdminUsersView, AdminResultsView). Error message diproses melalui helper getErrorMessage() yang menerjemahkan error Supabase/auth ke Bahasa Indonesia.</ns0:t>
-      </ns0:r>
-    </ns0:p>
-    <ns0:p>
-      <ns0:r>
-        <ns0:t xml:space="preserve"/>
-      </ns0:r>
-    </ns0:p>
-    <ns0:p>
-      <ns0:pPr>
-        <ns0:pStyle ns0:val="Heading2"/>
-      </ns0:pPr>
-      <ns0:r>
-        <ns0:t xml:space="preserve">7.3 Animasi CSS</ns0:t>
+        <ns0:t xml:space="preserve">7.1 SweetAlert2</ns0:t>
+      </ns0:r>
+    </ns0:p>
+    <ns0:p>
+      <ns0:r>
+        <ns0:t xml:space="preserve">Digunakan sebagai mekanisme feedback utama untuk error, konfirmasi, dan success message di 7 file (AuthView, BingungView, ChangePasswordView, SupabaseSqlView, AdminUsersView, AdminResultsView, DashboardView). Error message diproses melalui helper getErrorMessage() yang menerjemahkan error Supabase/auth ke Bahasa Indonesia.</ns0:t>
+      </ns0:r>
+    </ns0:p>
+    <ns0:p>
+      <ns0:r>
+        <ns0:t xml:space="preserve"/>
+      </ns0:r>
+    </ns0:p>
+    <ns0:p>
+      <ns0:pPr>
+        <ns0:pStyle ns0:val="Heading2"/>
+      </ns0:pPr>
+      <ns0:r>
+        <ns0:t xml:space="preserve">7.2 Animasi CSS</ns0:t>
       </ns0:r>
     </ns0:p>
     <ns0:p>
@@ -1677,7 +1865,7 @@
         </ns0:numPr>
       </ns0:pPr>
       <ns0:r>
-        <ns0:t xml:space="preserve">src/lib/store.ts - AppStore singleton (687 baris) - global state, Supabase sync, scoring engine, gap analysis, admin CRUD</ns0:t>
+        <ns0:t xml:space="preserve">src/lib/store.ts - AppStore singleton (910 baris) - global state, Supabase sync, scoring engine, gap analysis, admin CRUD</ns0:t>
       </ns0:r>
     </ns0:p>
     <ns0:p>
@@ -1830,7 +2018,7 @@
         </ns0:numPr>
       </ns0:pPr>
       <ns0:r>
-        <ns0:t xml:space="preserve">src/components/views/ - 16 participant views + 7 admin views, semuanya code-split via React.lazy</ns0:t>
+        <ns0:t xml:space="preserve">src/components/views/ - 14 participant views + 7 admin views, semuanya code-split via React.lazy</ns0:t>
       </ns0:r>
     </ns0:p>
     <ns0:p>

</xml_diff>

<commit_message>
feat: riwayat login, perbaiki toggle peran admin, dan migrasi leaderboard ke nilai UTBK
- guard_profile_role kini RAISE EXCEPTION (42501) alih-alih revert senyap
- AdminUsersView.toggleRole pakai .select() + deteksi no-op/error
- tabel login_events + Edge Function record-login + dialog Riwayat Login
- AdminDashboard count dari utbk_scores, AdminResults leaderboard dari utbk_scores
- hapus query tryout_results yang sudah di-drop, rewrite get_leaderboard ke utbk_scores
- selaraskan blueprint mockData.ts + gen_docx.py
</commit_message>
<xml_diff>
--- a/DOKUMENTASI_TEKNOLOGI.docx
+++ b/DOKUMENTASI_TEKNOLOGI.docx
@@ -950,24 +950,24 @@
         </ns0:numPr>
       </ns0:pPr>
       <ns0:r>
-        <ns0:t xml:space="preserve">tryout_results: Hasil tryout (user_id, tryout_id, total_score, predicate, scores JSONB per subtes)</ns0:t>
-      </ns0:r>
-    </ns0:p>
-    <ns0:p>
-      <ns0:pPr>
-        <ns0:numPr>
-          <ns0:ilvl ns0:val="0"/>
-          <ns0:numId ns0:val="1"/>
-        </ns0:numPr>
-      </ns0:pPr>
-      <ns0:pPr>
-        <ns0:numPr>
-          <ns0:ilvl ns0:val="0"/>
-          <ns0:numId ns0:val="1"/>
-        </ns0:numPr>
-      </ns0:pPr>
-      <ns0:r>
-        <ns0:t xml:space="preserve">utbk_scores: Riwayat input nilai tryout UTBK mandiri user (user_id, total_score, scores JSONB 7 subtes, label, recorded_on)</ns0:t>
+        <ns0:t xml:space="preserve">utbk_scores: Riwayat input nilai tryout UTBK mandiri user (user_id, total_score, scores JSONB 7 subtes, label, recorded_on) — sumber nilai tunggal menggantikan tryout_results yang telah dihapus</ns0:t>
+      </ns0:r>
+    </ns0:p>
+    <ns0:p>
+      <ns0:pPr>
+        <ns0:numPr>
+          <ns0:ilvl ns0:val="0"/>
+          <ns0:numId ns0:val="1"/>
+        </ns0:numPr>
+      </ns0:pPr>
+      <ns0:pPr>
+        <ns0:numPr>
+          <ns0:ilvl ns0:val="0"/>
+          <ns0:numId ns0:val="1"/>
+        </ns0:numPr>
+      </ns0:pPr>
+      <ns0:r>
+        <ns0:t xml:space="preserve">login_events: Riwayat login user (user_id, ip, city, region, country, user_agent, created_at) — diisi Edge Function record-login via service role, dibaca admin/pemilik akun</ns0:t>
       </ns0:r>
     </ns0:p>
     <ns0:p>
@@ -1138,7 +1138,7 @@
         </ns0:numPr>
       </ns0:pPr>
       <ns0:r>
-        <ns0:t xml:space="preserve">get_leaderboard - Leaderboard nasional skor tertinggi per user</ns0:t>
+        <ns0:t xml:space="preserve">get_leaderboard - Leaderboard nasional skor terbaik per user; kini membaca tabel utbk_scores (param p_type dipertahankan namun diabaikan)</ns0:t>
       </ns0:r>
     </ns0:p>
     <ns0:p>

</xml_diff>

<commit_message>
feat: batasi riwayat login & ubah peran ke admin utama (is_super_admin)
- helper is_super_admin() + guard_profile_role & policy login_events pakai itu
- export SUPER_ADMIN_ID; AdminUsersView sembunyikan tombol Riwayat & ubah peran untuk admin non-utama
- selaraskan blueprint mockData.ts + gen_docx.py + regenerasi docx
</commit_message>
<xml_diff>
--- a/DOKUMENTASI_TEKNOLOGI.docx
+++ b/DOKUMENTASI_TEKNOLOGI.docx
@@ -967,7 +967,7 @@
         </ns0:numPr>
       </ns0:pPr>
       <ns0:r>
-        <ns0:t xml:space="preserve">login_events: Riwayat login user (user_id, ip, city, region, country, user_agent, created_at) — diisi Edge Function record-login via service role, dibaca admin/pemilik akun</ns0:t>
+        <ns0:t xml:space="preserve">login_events: Riwayat login user (user_id, ip, city, region, country, user_agent, created_at) — diisi Edge Function record-login via service role, dibaca admin utama/pemilik akun</ns0:t>
       </ns0:r>
     </ns0:p>
     <ns0:p>
@@ -1539,6 +1539,126 @@
       </ns0:pPr>
       <ns0:r>
         <ns0:t xml:space="preserve">Pencarian kampus di seluruh aplikasi mendukung singkatan (kolom institutions.abbreviation) melalui helper institutionSearch + komponen CampusCombobox</ns0:t>
+      </ns0:r>
+    </ns0:p>
+    <ns0:p>
+      <ns0:r>
+        <ns0:t xml:space="preserve"/>
+      </ns0:r>
+    </ns0:p>
+    <ns0:p>
+      <ns0:pPr>
+        <ns0:pStyle ns0:val="Heading2"/>
+      </ns0:pPr>
+      <ns0:r>
+        <ns0:t xml:space="preserve">5.10 Riwayat Login &amp; Kontrol Akses Admin Utama</ns0:t>
+      </ns0:r>
+    </ns0:p>
+    <ns0:p>
+      <ns0:r>
+        <ns0:t xml:space="preserve">Setiap kali user benar-benar login (event SIGNED_IN), AppStore memanggil Edge Function record-login yang mencatat IP, lokasi (kota/provinsi/negara via lookup IP), user-agent, dan waktu ke tabel login_events. Riwayat ditampilkan per pengguna lewat dialog LoginHistoryDialog pada halaman Daftar Pengguna (AdminUsersView).</ns0:t>
+      </ns0:r>
+    </ns0:p>
+    <ns0:p>
+      <ns0:pPr>
+        <ns0:numPr>
+          <ns0:ilvl ns0:val="0"/>
+          <ns0:numId ns0:val="1"/>
+        </ns0:numPr>
+      </ns0:pPr>
+      <ns0:pPr>
+        <ns0:numPr>
+          <ns0:ilvl ns0:val="0"/>
+          <ns0:numId ns0:val="1"/>
+        </ns0:numPr>
+      </ns0:pPr>
+      <ns0:r>
+        <ns0:t xml:space="preserve">record-login (Edge Function, verify_jwt) - membaca identitas dari JWT, mencatat ke login_events memakai service role; tidak ada policy INSERT untuk authenticated agar data tidak bisa dipalsukan klien</ns0:t>
+      </ns0:r>
+    </ns0:p>
+    <ns0:p>
+      <ns0:pPr>
+        <ns0:numPr>
+          <ns0:ilvl ns0:val="0"/>
+          <ns0:numId ns0:val="1"/>
+        </ns0:numPr>
+      </ns0:pPr>
+      <ns0:pPr>
+        <ns0:numPr>
+          <ns0:ilvl ns0:val="0"/>
+          <ns0:numId ns0:val="1"/>
+        </ns0:numPr>
+      </ns0:pPr>
+      <ns0:r>
+        <ns0:t xml:space="preserve">login_events_select_own - tiap pengguna dapat melihat riwayat login miliknya sendiri</ns0:t>
+      </ns0:r>
+    </ns0:p>
+    <ns0:p>
+      <ns0:pPr>
+        <ns0:numPr>
+          <ns0:ilvl ns0:val="0"/>
+          <ns0:numId ns0:val="1"/>
+        </ns0:numPr>
+      </ns0:pPr>
+      <ns0:pPr>
+        <ns0:numPr>
+          <ns0:ilvl ns0:val="0"/>
+          <ns0:numId ns0:val="1"/>
+        </ns0:numPr>
+      </ns0:pPr>
+      <ns0:r>
+        <ns0:t xml:space="preserve">login_events_select_admin - hanya admin utama (is_super_admin) yang dapat melihat riwayat seluruh akun</ns0:t>
+      </ns0:r>
+    </ns0:p>
+    <ns0:p>
+      <ns0:pPr>
+        <ns0:numPr>
+          <ns0:ilvl ns0:val="0"/>
+          <ns0:numId ns0:val="1"/>
+        </ns0:numPr>
+      </ns0:pPr>
+      <ns0:pPr>
+        <ns0:numPr>
+          <ns0:ilvl ns0:val="0"/>
+          <ns0:numId ns0:val="1"/>
+        </ns0:numPr>
+      </ns0:pPr>
+      <ns0:r>
+        <ns0:t xml:space="preserve">is_super_admin() - helper yang mengunci aksi sensitif ke satu akun admin utama (hardcode auth uid admin1)</ns0:t>
+      </ns0:r>
+    </ns0:p>
+    <ns0:p>
+      <ns0:pPr>
+        <ns0:numPr>
+          <ns0:ilvl ns0:val="0"/>
+          <ns0:numId ns0:val="1"/>
+        </ns0:numPr>
+      </ns0:pPr>
+      <ns0:pPr>
+        <ns0:numPr>
+          <ns0:ilvl ns0:val="0"/>
+          <ns0:numId ns0:val="1"/>
+        </ns0:numPr>
+      </ns0:pPr>
+      <ns0:r>
+        <ns0:t xml:space="preserve">guard_profile_role() - perubahan kolom role hanya boleh dilakukan admin utama; pelanggaran memunculkan error 42501 (bukan dibatalkan senyap)</ns0:t>
+      </ns0:r>
+    </ns0:p>
+    <ns0:p>
+      <ns0:pPr>
+        <ns0:numPr>
+          <ns0:ilvl ns0:val="0"/>
+          <ns0:numId ns0:val="1"/>
+        </ns0:numPr>
+      </ns0:pPr>
+      <ns0:pPr>
+        <ns0:numPr>
+          <ns0:ilvl ns0:val="0"/>
+          <ns0:numId ns0:val="1"/>
+        </ns0:numPr>
+      </ns0:pPr>
+      <ns0:r>
+        <ns0:t xml:space="preserve">UI Daftar Pengguna menyembunyikan tombol Riwayat dan ubah peran (Jadikan/Turunkan Admin) bagi admin non-utama</ns0:t>
       </ns0:r>
     </ns0:p>
     <ns0:p>

</xml_diff>

<commit_message>
feat(penjurusan): bobot per soal (2-5), 12 soal baru, edit bobot inline di admin
</commit_message>
<xml_diff>
--- a/DOKUMENTASI_TEKNOLOGI.docx
+++ b/DOKUMENTASI_TEKNOLOGI.docx
@@ -1018,7 +1018,7 @@
         </ns0:numPr>
       </ns0:pPr>
       <ns0:r>
-        <ns0:t xml:space="preserve">penjurusan_questions: Bank soal tes penjurusan (question, option_a-d, cluster_a-d, weight_a-d bobot 1-5, is_active)</ns0:t>
+        <ns0:t xml:space="preserve">penjurusan_questions: Bank soal tes penjurusan (question, option_a-d, cluster_a-d, weight bobot per-soal 1-5, is_active; weight_a-d lama tidak dipakai lagi)</ns0:t>
       </ns0:r>
     </ns0:p>
     <ns0:p>
@@ -1453,24 +1453,24 @@
     </ns0:p>
     <ns0:p>
       <ns0:r>
-        <ns0:t xml:space="preserve">Tes penjurusan di BingungView.tsx memetakan tiap opsi jawaban ke rumpun (Saintek/Soshum/Campuran) dengan bobot 1-5 (kolom weight_a-d pada penjurusan_questions):</ns0:t>
-      </ns0:r>
-    </ns0:p>
-    <ns0:p>
-      <ns0:pPr>
-        <ns0:numPr>
-          <ns0:ilvl ns0:val="0"/>
-          <ns0:numId ns0:val="1"/>
-        </ns0:numPr>
-      </ns0:pPr>
-      <ns0:pPr>
-        <ns0:numPr>
-          <ns0:ilvl ns0:val="0"/>
-          <ns0:numId ns0:val="1"/>
-        </ns0:numPr>
-      </ns0:pPr>
-      <ns0:r>
-        <ns0:t xml:space="preserve">Skor rumpun = akumulasi bobot opsi yang dipilih (weighted tally), bukan sekadar jumlah jawaban</ns0:t>
+        <ns0:t xml:space="preserve">Tes penjurusan di BingungView.tsx memetakan tiap opsi jawaban ke rumpun (Saintek/Soshum/Campuran). Setiap SOAL memiliki bobot kepentingan 1-5 (kolom weight pada penjurusan_questions):</ns0:t>
+      </ns0:r>
+    </ns0:p>
+    <ns0:p>
+      <ns0:pPr>
+        <ns0:numPr>
+          <ns0:ilvl ns0:val="0"/>
+          <ns0:numId ns0:val="1"/>
+        </ns0:numPr>
+      </ns0:pPr>
+      <ns0:pPr>
+        <ns0:numPr>
+          <ns0:ilvl ns0:val="0"/>
+          <ns0:numId ns0:val="1"/>
+        </ns0:numPr>
+      </ns0:pPr>
+      <ns0:r>
+        <ns0:t xml:space="preserve">Skor rumpun = akumulasi bobot soal yang dijawab ke rumpun itu (weighted tally), bukan sekadar jumlah jawaban; soal inti berbobot 4-5 dan soal pendukung 2-3</ns0:t>
       </ns0:r>
     </ns0:p>
     <ns0:p>
@@ -1504,24 +1504,24 @@
         </ns0:numPr>
       </ns0:pPr>
       <ns0:r>
-        <ns0:t xml:space="preserve">Bar hasil menampilkan persentase = skor rumpun / total skor x 100 (plus jumlah poin)</ns0:t>
-      </ns0:r>
-    </ns0:p>
-    <ns0:p>
-      <ns0:pPr>
-        <ns0:numPr>
-          <ns0:ilvl ns0:val="0"/>
-          <ns0:numId ns0:val="1"/>
-        </ns0:numPr>
-      </ns0:pPr>
-      <ns0:pPr>
-        <ns0:numPr>
-          <ns0:ilvl ns0:val="0"/>
-          <ns0:numId ns0:val="1"/>
-        </ns0:numPr>
-      </ns0:pPr>
-      <ns0:r>
-        <ns0:t xml:space="preserve">Admin dapat mengatur bobot tiap opsi (1-5) di Bank Soal Penjurusan (AdminQuestionsView)</ns0:t>
+        <ns0:t xml:space="preserve">Bar hasil menampilkan persentase ternormalisasi = skor rumpun / total bobot terjawab x 100 (plus jumlah poin)</ns0:t>
+      </ns0:r>
+    </ns0:p>
+    <ns0:p>
+      <ns0:pPr>
+        <ns0:numPr>
+          <ns0:ilvl ns0:val="0"/>
+          <ns0:numId ns0:val="1"/>
+        </ns0:numPr>
+      </ns0:pPr>
+      <ns0:pPr>
+        <ns0:numPr>
+          <ns0:ilvl ns0:val="0"/>
+          <ns0:numId ns0:val="1"/>
+        </ns0:numPr>
+      </ns0:pPr>
+      <ns0:r>
+        <ns0:t xml:space="preserve">Admin dapat mengubah bobot soal (1-5) langsung dari tabel Bank Soal Penjurusan (AdminQuestionsView) maupun saat menambah soal</ns0:t>
       </ns0:r>
     </ns0:p>
     <ns0:p>
@@ -1573,7 +1573,7 @@
         </ns0:numPr>
       </ns0:pPr>
       <ns0:r>
-        <ns0:t xml:space="preserve">record-login (Edge Function, verify_jwt) - membaca identitas dari JWT, mencatat ke login_events memakai service role; tidak ada policy INSERT untuk authenticated agar data tidak bisa dipalsukan klien</ns0:t>
+        <ns0:t xml:space="preserve">revoke-sessions (Edge Function, verify_jwt) - admin utama membatalkan semua sesi/refresh token akun target via RPC force_logout_user; memaksa user login ulang di semua device</ns0:t>
       </ns0:r>
     </ns0:p>
     <ns0:p>
@@ -2138,7 +2138,7 @@
         </ns0:numPr>
       </ns0:pPr>
       <ns0:r>
-        <ns0:t xml:space="preserve">src/components/views/ - 14 participant views + 7 admin views, semuanya code-split via React.lazy</ns0:t>
+        <ns0:t xml:space="preserve">src/components/views/ - 14 participant views + 6 admin views, semuanya code-split via React.lazy</ns0:t>
       </ns0:r>
     </ns0:p>
     <ns0:p>

</xml_diff>

<commit_message>
fix(penjurusan): bobot per jawaban (weight_a-d) dengan nilai 2-5 + edit bobot inline per opsi
</commit_message>
<xml_diff>
--- a/DOKUMENTASI_TEKNOLOGI.docx
+++ b/DOKUMENTASI_TEKNOLOGI.docx
@@ -1018,7 +1018,7 @@
         </ns0:numPr>
       </ns0:pPr>
       <ns0:r>
-        <ns0:t xml:space="preserve">penjurusan_questions: Bank soal tes penjurusan (question, option_a-d, cluster_a-d, weight bobot per-soal 1-5, is_active; weight_a-d lama tidak dipakai lagi)</ns0:t>
+        <ns0:t xml:space="preserve">penjurusan_questions: Bank soal tes penjurusan (question, option_a-d, cluster_a-d, weight_a-d bobot per-jawaban 1-5, is_active)</ns0:t>
       </ns0:r>
     </ns0:p>
     <ns0:p>
@@ -1453,24 +1453,24 @@
     </ns0:p>
     <ns0:p>
       <ns0:r>
-        <ns0:t xml:space="preserve">Tes penjurusan di BingungView.tsx memetakan tiap opsi jawaban ke rumpun (Saintek/Soshum/Campuran). Setiap SOAL memiliki bobot kepentingan 1-5 (kolom weight pada penjurusan_questions):</ns0:t>
-      </ns0:r>
-    </ns0:p>
-    <ns0:p>
-      <ns0:pPr>
-        <ns0:numPr>
-          <ns0:ilvl ns0:val="0"/>
-          <ns0:numId ns0:val="1"/>
-        </ns0:numPr>
-      </ns0:pPr>
-      <ns0:pPr>
-        <ns0:numPr>
-          <ns0:ilvl ns0:val="0"/>
-          <ns0:numId ns0:val="1"/>
-        </ns0:numPr>
-      </ns0:pPr>
-      <ns0:r>
-        <ns0:t xml:space="preserve">Skor rumpun = akumulasi bobot soal yang dijawab ke rumpun itu (weighted tally), bukan sekadar jumlah jawaban; soal inti berbobot 4-5 dan soal pendukung 2-3</ns0:t>
+        <ns0:t xml:space="preserve">Tes penjurusan di BingungView.tsx memetakan tiap opsi jawaban ke rumpun (Saintek/Soshum/Campuran) dengan bobot per jawaban 1-5 (kolom weight_a-d pada penjurusan_questions):</ns0:t>
+      </ns0:r>
+    </ns0:p>
+    <ns0:p>
+      <ns0:pPr>
+        <ns0:numPr>
+          <ns0:ilvl ns0:val="0"/>
+          <ns0:numId ns0:val="1"/>
+        </ns0:numPr>
+      </ns0:pPr>
+      <ns0:pPr>
+        <ns0:numPr>
+          <ns0:ilvl ns0:val="0"/>
+          <ns0:numId ns0:val="1"/>
+        </ns0:numPr>
+      </ns0:pPr>
+      <ns0:r>
+        <ns0:t xml:space="preserve">Skor rumpun = akumulasi bobot jawaban yang dipilih (weighted tally), bukan sekadar jumlah jawaban</ns0:t>
       </ns0:r>
     </ns0:p>
     <ns0:p>
@@ -1521,7 +1521,7 @@
         </ns0:numPr>
       </ns0:pPr>
       <ns0:r>
-        <ns0:t xml:space="preserve">Admin dapat mengubah bobot soal (1-5) langsung dari tabel Bank Soal Penjurusan (AdminQuestionsView) maupun saat menambah soal</ns0:t>
+        <ns0:t xml:space="preserve">Admin dapat mengubah bobot tiap jawaban (1-5) langsung dari tabel Bank Soal Penjurusan (AdminQuestionsView) maupun saat menambah soal</ns0:t>
       </ns0:r>
     </ns0:p>
     <ns0:p>

</xml_diff>